<commit_message>
draft: Grade 3 Egypt project (2 weeks): overview plan, 8 one-page lesson plans, Explorer Passport and hieroglyph alphabet (not live)
Co-Authored-By: Claude Opus 5.5 <noreply@anthropic.com>
</commit_message>
<xml_diff>
--- a/lesson-plans/Grade3-Egypt-Kingdom-Project-Plan.docx
+++ b/lesson-plans/Grade3-Egypt-Kingdom-Project-Plan.docx
@@ -7,7 +7,7 @@
         <w:pStyle w:val="Heading1"/>
       </w:pPr>
       <w:r>
-        <w:t xml:space="preserve">Grade 3 · Project: The Pharaoh’s Kingdom (Ancient Egypt) · models made at home · 4 lessons</w:t>
+        <w:t xml:space="preserve">Grade 3 · Project: The Pharaoh’s Kingdom (Ancient Egypt) · 2 weeks · 8 lessons · models made at home</w:t>
       </w:r>
     </w:p>
     <w:p>
@@ -18,7 +18,7 @@
         <w:rPr>
           <w:color w:val="475569"/>
         </w:rPr>
-        <w:t xml:space="preserve">4 × 35 minutes in class + 1–2 weeks of making at home · classes 3A and 3B · A1 · 4 groups · each pupil makes ONE model at home</w:t>
+        <w:t xml:space="preserve">8 × 35 minutes over two weeks · models made at home (due on lesson 6) · classes 3A and 3B · A1 · 4 groups · Explorer Passport</w:t>
       </w:r>
     </w:p>
     <w:p>
@@ -325,7 +325,7 @@
                 <w:sz w:val="18"/>
                 <w:szCs w:val="18"/>
               </w:rPr>
-              <w:t xml:space="preserve">L1 · 0–5</w:t>
+              <w:t xml:space="preserve">Lesson 1</w:t>
             </w:r>
           </w:p>
         </w:tc>
@@ -350,7 +350,7 @@
                 <w:sz w:val="18"/>
                 <w:szCs w:val="18"/>
               </w:rPr>
-              <w:t xml:space="preserve">Mystery box</w:t>
+              <w:t xml:space="preserve">The Pharaoh’s message</w:t>
             </w:r>
           </w:p>
         </w:tc>
@@ -375,7 +375,7 @@
                 <w:sz w:val="18"/>
                 <w:szCs w:val="18"/>
               </w:rPr>
-              <w:t xml:space="preserve">Covered box with pictures: pyramid, crown, papyrus, boat, jar, Senet board. Ask: What do you think is inside? Take things out one by one.</w:t>
+              <w:t xml:space="preserve">Mystery box, the Pharaoh’s letter, missions; each pupil chooses ONE model; home pack goes home.</w:t>
             </w:r>
           </w:p>
         </w:tc>
@@ -400,7 +400,7 @@
                 <w:sz w:val="18"/>
                 <w:szCs w:val="18"/>
               </w:rPr>
-              <w:t xml:space="preserve">Guess, then say each word.</w:t>
+              <w:t xml:space="preserve">Say: I make a …</w:t>
             </w:r>
           </w:p>
         </w:tc>
@@ -425,7 +425,7 @@
                 <w:sz w:val="17"/>
                 <w:szCs w:val="17"/>
               </w:rPr>
-              <w:t xml:space="preserve">Put each word on the word wall.</w:t>
+              <w:t xml:space="preserve">Passports out; due date = lesson 6.</w:t>
             </w:r>
           </w:p>
         </w:tc>
@@ -455,7 +455,7 @@
                 <w:sz w:val="18"/>
                 <w:szCs w:val="18"/>
               </w:rPr>
-              <w:t xml:space="preserve">L1 · 5–12</w:t>
+              <w:t xml:space="preserve">Lesson 2</w:t>
             </w:r>
           </w:p>
         </w:tc>
@@ -480,7 +480,7 @@
                 <w:sz w:val="18"/>
                 <w:szCs w:val="18"/>
               </w:rPr>
-              <w:t xml:space="preserve">The Pharaoh’s letter</w:t>
+              <w:t xml:space="preserve">The Nile</w:t>
             </w:r>
           </w:p>
         </w:tc>
@@ -505,7 +505,7 @@
                 <w:sz w:val="18"/>
                 <w:szCs w:val="18"/>
               </w:rPr>
-              <w:t xml:space="preserve">Read the letter (scroll): “Hello, children! I am the Pharaoh. I need your help. Can you help me build my kingdom?”</w:t>
+              <w:t xml:space="preserve">Picture story; “We use it to …” game with boat, jar, shaduf, papyrus.</w:t>
             </w:r>
           </w:p>
         </w:tc>
@@ -530,7 +530,7 @@
                 <w:sz w:val="18"/>
                 <w:szCs w:val="18"/>
               </w:rPr>
-              <w:t xml:space="preserve">Answer: Yes! We are ready!</w:t>
+              <w:t xml:space="preserve">Write 2 sentences in the passport.</w:t>
             </w:r>
           </w:p>
         </w:tc>
@@ -555,7 +555,7 @@
                 <w:sz w:val="17"/>
                 <w:szCs w:val="17"/>
               </w:rPr>
-              <w:t xml:space="preserve">Deep Pharaoh voice; show the empty board.</w:t>
+              <w:t xml:space="preserve">How is your model?</w:t>
             </w:r>
           </w:p>
         </w:tc>
@@ -585,7 +585,7 @@
                 <w:sz w:val="18"/>
                 <w:szCs w:val="18"/>
               </w:rPr>
-              <w:t xml:space="preserve">L1 · 12–25</w:t>
+              <w:t xml:space="preserve">Lesson 3</w:t>
             </w:r>
           </w:p>
         </w:tc>
@@ -610,7 +610,7 @@
                 <w:sz w:val="18"/>
                 <w:szCs w:val="18"/>
               </w:rPr>
-              <w:t xml:space="preserve">Missions</w:t>
+              <w:t xml:space="preserve">The pyramids</w:t>
             </w:r>
           </w:p>
         </w:tc>
@@ -635,7 +635,7 @@
                 <w:sz w:val="18"/>
                 <w:szCs w:val="18"/>
               </w:rPr>
-              <w:t xml:space="preserve">Groups get their mission card. Each pupil chooses (or you give) ONE model to make at home; write it in your list. Show the home sheet and the due date.</w:t>
+              <w:t xml:space="preserve">Facts (tombs, square base, triangle sides); measure and compare objects.</w:t>
             </w:r>
           </w:p>
         </w:tc>
@@ -660,7 +660,7 @@
                 <w:sz w:val="18"/>
                 <w:szCs w:val="18"/>
               </w:rPr>
-              <w:t xml:space="preserve">Choose your model; read your 3 sentences.</w:t>
+              <w:t xml:space="preserve">bigger / taller / smaller than</w:t>
             </w:r>
           </w:p>
         </w:tc>
@@ -685,7 +685,7 @@
                 <w:sz w:val="17"/>
                 <w:szCs w:val="17"/>
               </w:rPr>
-              <w:t xml:space="preserve">Keep the list of who makes what.</w:t>
+              <w:t xml:space="preserve">Rulers.</w:t>
             </w:r>
           </w:p>
         </w:tc>
@@ -715,7 +715,7 @@
                 <w:sz w:val="18"/>
                 <w:szCs w:val="18"/>
               </w:rPr>
-              <w:t xml:space="preserve">L1 · 25–35</w:t>
+              <w:t xml:space="preserve">Lesson 4</w:t>
             </w:r>
           </w:p>
         </w:tc>
@@ -740,7 +740,7 @@
                 <w:sz w:val="18"/>
                 <w:szCs w:val="18"/>
               </w:rPr>
-              <w:t xml:space="preserve">Learn and say</w:t>
+              <w:t xml:space="preserve">Writing like a scribe</w:t>
             </w:r>
           </w:p>
         </w:tc>
@@ -765,7 +765,7 @@
                 <w:sz w:val="18"/>
                 <w:szCs w:val="18"/>
               </w:rPr>
-              <w:t xml:space="preserve">Pictures and facts for each group on the board; quick quiz across groups. Everybody practises their 3 sentences.</w:t>
+              <w:t xml:space="preserve">Names in hieroglyphs on a paper cartouche (calm lesson).</w:t>
             </w:r>
           </w:p>
         </w:tc>
@@ -790,7 +790,7 @@
                 <w:sz w:val="18"/>
                 <w:szCs w:val="18"/>
               </w:rPr>
-              <w:t xml:space="preserve">Answer; say your sentences.</w:t>
+              <w:t xml:space="preserve">This is my name. This is an owl.</w:t>
             </w:r>
           </w:p>
         </w:tc>
@@ -815,7 +815,7 @@
                 <w:sz w:val="17"/>
                 <w:szCs w:val="17"/>
               </w:rPr>
-              <w:t xml:space="preserve">Home sheet goes home today (and on k12).</w:t>
+              <w:t xml:space="preserve">k12 reminder: models due in 2 days.</w:t>
             </w:r>
           </w:p>
         </w:tc>
@@ -845,7 +845,7 @@
                 <w:sz w:val="18"/>
                 <w:szCs w:val="18"/>
               </w:rPr>
-              <w:t xml:space="preserve">L2 · 0–10</w:t>
+              <w:t xml:space="preserve">Lesson 5</w:t>
             </w:r>
           </w:p>
         </w:tc>
@@ -870,7 +870,7 @@
                 <w:sz w:val="18"/>
                 <w:szCs w:val="18"/>
               </w:rPr>
-              <w:t xml:space="preserve">How is your model?</w:t>
+              <w:t xml:space="preserve">Palace people</w:t>
             </w:r>
           </w:p>
         </w:tc>
@@ -895,7 +895,7 @@
                 <w:sz w:val="18"/>
                 <w:szCs w:val="18"/>
               </w:rPr>
-              <w:t xml:space="preserve">Pupils say how their model is going: “I am making a crown. It is red and white.” “I need a box.”</w:t>
+              <w:t xml:space="preserve">Role-card mingle and guess who (pharaoh, guard, priest).</w:t>
             </w:r>
           </w:p>
         </w:tc>
@@ -920,7 +920,7 @@
                 <w:sz w:val="18"/>
                 <w:szCs w:val="18"/>
               </w:rPr>
-              <w:t xml:space="preserve">Say one sentence about your model.</w:t>
+              <w:t xml:space="preserve">I am … I wear … I have …</w:t>
             </w:r>
           </w:p>
         </w:tc>
@@ -945,7 +945,7 @@
                 <w:sz w:val="17"/>
                 <w:szCs w:val="17"/>
               </w:rPr>
-              <w:t xml:space="preserve">Note who needs materials; offer the spare box.</w:t>
+              <w:t xml:space="preserve">Final reminder.</w:t>
             </w:r>
           </w:p>
         </w:tc>
@@ -975,7 +975,7 @@
                 <w:sz w:val="18"/>
                 <w:szCs w:val="18"/>
               </w:rPr>
-              <w:t xml:space="preserve">L2 · 10–30</w:t>
+              <w:t xml:space="preserve">Lesson 6</w:t>
             </w:r>
           </w:p>
         </w:tc>
@@ -1000,7 +1000,7 @@
                 <w:sz w:val="18"/>
                 <w:szCs w:val="18"/>
               </w:rPr>
-              <w:t xml:space="preserve">Language games</w:t>
+              <w:t xml:space="preserve">Models arrive</w:t>
             </w:r>
           </w:p>
         </w:tc>
@@ -1025,7 +1025,7 @@
                 <w:sz w:val="18"/>
                 <w:szCs w:val="18"/>
               </w:rPr>
-              <w:t xml:space="preserve">Word-wall games: bigger / taller / smaller with real objects; next to / behind / in front of with classroom things; “We use it to …” guessing game.</w:t>
+              <w:t xml:space="preserve">Build the kingdom board; describe positions; spare box for missing models.</w:t>
             </w:r>
           </w:p>
         </w:tc>
@@ -1050,7 +1050,7 @@
                 <w:sz w:val="18"/>
                 <w:szCs w:val="18"/>
               </w:rPr>
-              <w:t xml:space="preserve">Play in teams; answer in full sentences.</w:t>
+              <w:t xml:space="preserve">next to, behind, in front of</w:t>
             </w:r>
           </w:p>
         </w:tc>
@@ -1075,7 +1075,7 @@
                 <w:sz w:val="17"/>
                 <w:szCs w:val="17"/>
               </w:rPr>
-              <w:t xml:space="preserve">Team points for full sentences.</w:t>
+              <w:t xml:space="preserve">Tick arrivals.</w:t>
             </w:r>
           </w:p>
         </w:tc>
@@ -1105,7 +1105,7 @@
                 <w:sz w:val="18"/>
                 <w:szCs w:val="18"/>
               </w:rPr>
-              <w:t xml:space="preserve">L2 · 30–35</w:t>
+              <w:t xml:space="preserve">Lesson 7</w:t>
             </w:r>
           </w:p>
         </w:tc>
@@ -1130,7 +1130,7 @@
                 <w:sz w:val="18"/>
                 <w:szCs w:val="18"/>
               </w:rPr>
-              <w:t xml:space="preserve">Practise the tour</w:t>
+              <w:t xml:space="preserve">Rehearsal and Senet</w:t>
             </w:r>
           </w:p>
         </w:tc>
@@ -1155,7 +1155,7 @@
                 <w:sz w:val="18"/>
                 <w:szCs w:val="18"/>
               </w:rPr>
-              <w:t xml:space="preserve">Each pupil says their 2 tour sentences to a partner.</w:t>
+              <w:t xml:space="preserve">Rehearse the tour; learn Senet with game English.</w:t>
             </w:r>
           </w:p>
         </w:tc>
@@ -1180,7 +1180,7 @@
                 <w:sz w:val="18"/>
                 <w:szCs w:val="18"/>
               </w:rPr>
-              <w:t xml:space="preserve">Practise with a partner.</w:t>
+              <w:t xml:space="preserve">It’s my turn. Throw the sticks.</w:t>
             </w:r>
           </w:p>
         </w:tc>
@@ -1205,7 +1205,7 @@
                 <w:sz w:val="17"/>
                 <w:szCs w:val="17"/>
               </w:rPr>
-              <w:t xml:space="preserve">Help with the first words.</w:t>
+              <w:t xml:space="preserve">Invite guests.</w:t>
             </w:r>
           </w:p>
         </w:tc>
@@ -1235,7 +1235,7 @@
                 <w:sz w:val="18"/>
                 <w:szCs w:val="18"/>
               </w:rPr>
-              <w:t xml:space="preserve">L3 · 0–20</w:t>
+              <w:t xml:space="preserve">Lesson 8</w:t>
             </w:r>
           </w:p>
         </w:tc>
@@ -1260,7 +1260,7 @@
                 <w:sz w:val="18"/>
                 <w:szCs w:val="18"/>
               </w:rPr>
-              <w:t xml:space="preserve">Build the kingdom</w:t>
+              <w:t xml:space="preserve">The kingdom tour</w:t>
             </w:r>
           </w:p>
         </w:tc>
@@ -1285,7 +1285,7 @@
                 <w:sz w:val="18"/>
                 <w:szCs w:val="18"/>
               </w:rPr>
-              <w:t xml:space="preserve">Models arrive. Each pupil places their model on the board and says where: The pyramids are in the desert. The boat is on the Nile. The Senet games are next to the palace.</w:t>
+              <w:t xml:space="preserve">Every pupil presents in 2 sentences; Senet; writing; certificates.</w:t>
             </w:r>
           </w:p>
         </w:tc>
@@ -1310,7 +1310,7 @@
                 <w:sz w:val="18"/>
                 <w:szCs w:val="18"/>
               </w:rPr>
-              <w:t xml:space="preserve">Place and describe.</w:t>
+              <w:t xml:space="preserve">All the language</w:t>
             </w:r>
           </w:p>
         </w:tc>
@@ -1335,527 +1335,7 @@
                 <w:sz w:val="17"/>
                 <w:szCs w:val="17"/>
               </w:rPr>
-              <w:t xml:space="preserve">Pupils without a model make a simple one from the spare box.</w:t>
-            </w:r>
-          </w:p>
-        </w:tc>
-      </w:tr>
-      <w:tr>
-        <w:trPr>
-          <w:cantSplit/>
-        </w:trPr>
-        <w:tc>
-          <w:tcPr>
-            <w:tcW w:type="dxa" w:w="800"/>
-            <w:tcMar>
-              <w:top w:type="dxa" w:w="60"/>
-              <w:left w:type="dxa" w:w="90"/>
-              <w:bottom w:type="dxa" w:w="60"/>
-              <w:right w:type="dxa" w:w="90"/>
-            </w:tcMar>
-          </w:tcPr>
-          <w:p>
-            <w:pPr>
-              <w:spacing w:after="40"/>
-            </w:pPr>
-            <w:r>
-              <w:rPr>
-                <w:b w:val="false"/>
-                <w:bCs w:val="false"/>
-                <w:sz w:val="18"/>
-                <w:szCs w:val="18"/>
-              </w:rPr>
-              <w:t xml:space="preserve">L3 · 20–35</w:t>
-            </w:r>
-          </w:p>
-        </w:tc>
-        <w:tc>
-          <w:tcPr>
-            <w:tcW w:type="dxa" w:w="1800"/>
-            <w:tcMar>
-              <w:top w:type="dxa" w:w="60"/>
-              <w:left w:type="dxa" w:w="90"/>
-              <w:bottom w:type="dxa" w:w="60"/>
-              <w:right w:type="dxa" w:w="90"/>
-            </w:tcMar>
-          </w:tcPr>
-          <w:p>
-            <w:pPr>
-              <w:spacing w:after="40"/>
-            </w:pPr>
-            <w:r>
-              <w:rPr>
-                <w:b/>
-                <w:bCs/>
-                <w:sz w:val="18"/>
-                <w:szCs w:val="18"/>
-              </w:rPr>
-              <w:t xml:space="preserve">Rehearse the tour</w:t>
-            </w:r>
-          </w:p>
-        </w:tc>
-        <w:tc>
-          <w:tcPr>
-            <w:tcW w:type="dxa" w:w="2800"/>
-            <w:tcMar>
-              <w:top w:type="dxa" w:w="60"/>
-              <w:left w:type="dxa" w:w="90"/>
-              <w:bottom w:type="dxa" w:w="60"/>
-              <w:right w:type="dxa" w:w="90"/>
-            </w:tcMar>
-          </w:tcPr>
-          <w:p>
-            <w:pPr>
-              <w:spacing w:after="40"/>
-            </w:pPr>
-            <w:r>
-              <w:rPr>
-                <w:b w:val="false"/>
-                <w:bCs w:val="false"/>
-                <w:sz w:val="18"/>
-                <w:szCs w:val="18"/>
-              </w:rPr>
-              <w:t xml:space="preserve">Run the tour once: each group 2–3 minutes, every pupil two sentences. Group 4 teaches the class to play Senet: It’s my turn. Throw the sticks!</w:t>
-            </w:r>
-          </w:p>
-        </w:tc>
-        <w:tc>
-          <w:tcPr>
-            <w:tcW w:type="dxa" w:w="2260"/>
-            <w:tcMar>
-              <w:top w:type="dxa" w:w="60"/>
-              <w:left w:type="dxa" w:w="90"/>
-              <w:bottom w:type="dxa" w:w="60"/>
-              <w:right w:type="dxa" w:w="90"/>
-            </w:tcMar>
-          </w:tcPr>
-          <w:p>
-            <w:pPr>
-              <w:spacing w:after="40"/>
-            </w:pPr>
-            <w:r>
-              <w:rPr>
-                <w:b w:val="false"/>
-                <w:bCs w:val="false"/>
-                <w:sz w:val="18"/>
-                <w:szCs w:val="18"/>
-              </w:rPr>
-              <w:t xml:space="preserve">Rehearse; clap for each group.</w:t>
-            </w:r>
-          </w:p>
-        </w:tc>
-        <w:tc>
-          <w:tcPr>
-            <w:tcW w:type="dxa" w:w="1700"/>
-            <w:tcMar>
-              <w:top w:type="dxa" w:w="60"/>
-              <w:left w:type="dxa" w:w="90"/>
-              <w:bottom w:type="dxa" w:w="60"/>
-              <w:right w:type="dxa" w:w="90"/>
-            </w:tcMar>
-          </w:tcPr>
-          <w:p>
-            <w:pPr>
-              <w:spacing w:after="40"/>
-            </w:pPr>
-            <w:r>
-              <w:rPr>
-                <w:b w:val="false"/>
-                <w:bCs w:val="false"/>
-                <w:sz w:val="17"/>
-                <w:szCs w:val="17"/>
-              </w:rPr>
-              <w:t xml:space="preserve">Fix the order and the timing.</w:t>
-            </w:r>
-          </w:p>
-        </w:tc>
-      </w:tr>
-      <w:tr>
-        <w:trPr>
-          <w:cantSplit/>
-        </w:trPr>
-        <w:tc>
-          <w:tcPr>
-            <w:tcW w:type="dxa" w:w="800"/>
-            <w:tcMar>
-              <w:top w:type="dxa" w:w="60"/>
-              <w:left w:type="dxa" w:w="90"/>
-              <w:bottom w:type="dxa" w:w="60"/>
-              <w:right w:type="dxa" w:w="90"/>
-            </w:tcMar>
-          </w:tcPr>
-          <w:p>
-            <w:pPr>
-              <w:spacing w:after="40"/>
-            </w:pPr>
-            <w:r>
-              <w:rPr>
-                <w:b w:val="false"/>
-                <w:bCs w:val="false"/>
-                <w:sz w:val="18"/>
-                <w:szCs w:val="18"/>
-              </w:rPr>
-              <w:t xml:space="preserve">L4 · 0–20</w:t>
-            </w:r>
-          </w:p>
-        </w:tc>
-        <w:tc>
-          <w:tcPr>
-            <w:tcW w:type="dxa" w:w="1800"/>
-            <w:tcMar>
-              <w:top w:type="dxa" w:w="60"/>
-              <w:left w:type="dxa" w:w="90"/>
-              <w:bottom w:type="dxa" w:w="60"/>
-              <w:right w:type="dxa" w:w="90"/>
-            </w:tcMar>
-          </w:tcPr>
-          <w:p>
-            <w:pPr>
-              <w:spacing w:after="40"/>
-            </w:pPr>
-            <w:r>
-              <w:rPr>
-                <w:b/>
-                <w:bCs/>
-                <w:sz w:val="18"/>
-                <w:szCs w:val="18"/>
-              </w:rPr>
-              <w:t xml:space="preserve">The kingdom tour</w:t>
-            </w:r>
-          </w:p>
-        </w:tc>
-        <w:tc>
-          <w:tcPr>
-            <w:tcW w:type="dxa" w:w="2800"/>
-            <w:tcMar>
-              <w:top w:type="dxa" w:w="60"/>
-              <w:left w:type="dxa" w:w="90"/>
-              <w:bottom w:type="dxa" w:w="60"/>
-              <w:right w:type="dxa" w:w="90"/>
-            </w:tcMar>
-          </w:tcPr>
-          <w:p>
-            <w:pPr>
-              <w:spacing w:after="40"/>
-            </w:pPr>
-            <w:r>
-              <w:rPr>
-                <w:b w:val="false"/>
-                <w:bCs w:val="false"/>
-                <w:sz w:val="18"/>
-                <w:szCs w:val="18"/>
-              </w:rPr>
-              <w:t xml:space="preserve">Groups present in order (pyramids, palace, tools, Senet). Guests optional (another class or parents). Pupils wear crowns and collars.</w:t>
-            </w:r>
-          </w:p>
-        </w:tc>
-        <w:tc>
-          <w:tcPr>
-            <w:tcW w:type="dxa" w:w="2260"/>
-            <w:tcMar>
-              <w:top w:type="dxa" w:w="60"/>
-              <w:left w:type="dxa" w:w="90"/>
-              <w:bottom w:type="dxa" w:w="60"/>
-              <w:right w:type="dxa" w:w="90"/>
-            </w:tcMar>
-          </w:tcPr>
-          <w:p>
-            <w:pPr>
-              <w:spacing w:after="40"/>
-            </w:pPr>
-            <w:r>
-              <w:rPr>
-                <w:b w:val="false"/>
-                <w:bCs w:val="false"/>
-                <w:sz w:val="18"/>
-                <w:szCs w:val="18"/>
-              </w:rPr>
-              <w:t xml:space="preserve">Present: every pupil says two sentences.</w:t>
-            </w:r>
-          </w:p>
-        </w:tc>
-        <w:tc>
-          <w:tcPr>
-            <w:tcW w:type="dxa" w:w="1700"/>
-            <w:tcMar>
-              <w:top w:type="dxa" w:w="60"/>
-              <w:left w:type="dxa" w:w="90"/>
-              <w:bottom w:type="dxa" w:w="60"/>
-              <w:right w:type="dxa" w:w="90"/>
-            </w:tcMar>
-          </w:tcPr>
-          <w:p>
-            <w:pPr>
-              <w:spacing w:after="40"/>
-            </w:pPr>
-            <w:r>
-              <w:rPr>
-                <w:b w:val="false"/>
-                <w:bCs w:val="false"/>
-                <w:sz w:val="17"/>
-                <w:szCs w:val="17"/>
-              </w:rPr>
-              <w:t xml:space="preserve">Mark the speaking checklist (0–2 each sentence).</w:t>
-            </w:r>
-          </w:p>
-        </w:tc>
-      </w:tr>
-      <w:tr>
-        <w:trPr>
-          <w:cantSplit/>
-        </w:trPr>
-        <w:tc>
-          <w:tcPr>
-            <w:tcW w:type="dxa" w:w="800"/>
-            <w:tcMar>
-              <w:top w:type="dxa" w:w="60"/>
-              <w:left w:type="dxa" w:w="90"/>
-              <w:bottom w:type="dxa" w:w="60"/>
-              <w:right w:type="dxa" w:w="90"/>
-            </w:tcMar>
-          </w:tcPr>
-          <w:p>
-            <w:pPr>
-              <w:spacing w:after="40"/>
-            </w:pPr>
-            <w:r>
-              <w:rPr>
-                <w:b w:val="false"/>
-                <w:bCs w:val="false"/>
-                <w:sz w:val="18"/>
-                <w:szCs w:val="18"/>
-              </w:rPr>
-              <w:t xml:space="preserve">L4 · 20–30</w:t>
-            </w:r>
-          </w:p>
-        </w:tc>
-        <w:tc>
-          <w:tcPr>
-            <w:tcW w:type="dxa" w:w="1800"/>
-            <w:tcMar>
-              <w:top w:type="dxa" w:w="60"/>
-              <w:left w:type="dxa" w:w="90"/>
-              <w:bottom w:type="dxa" w:w="60"/>
-              <w:right w:type="dxa" w:w="90"/>
-            </w:tcMar>
-          </w:tcPr>
-          <w:p>
-            <w:pPr>
-              <w:spacing w:after="40"/>
-            </w:pPr>
-            <w:r>
-              <w:rPr>
-                <w:b/>
-                <w:bCs/>
-                <w:sz w:val="18"/>
-                <w:szCs w:val="18"/>
-              </w:rPr>
-              <w:t xml:space="preserve">Senet in English</w:t>
-            </w:r>
-          </w:p>
-        </w:tc>
-        <w:tc>
-          <w:tcPr>
-            <w:tcW w:type="dxa" w:w="2800"/>
-            <w:tcMar>
-              <w:top w:type="dxa" w:w="60"/>
-              <w:left w:type="dxa" w:w="90"/>
-              <w:bottom w:type="dxa" w:w="60"/>
-              <w:right w:type="dxa" w:w="90"/>
-            </w:tcMar>
-          </w:tcPr>
-          <w:p>
-            <w:pPr>
-              <w:spacing w:after="40"/>
-            </w:pPr>
-            <w:r>
-              <w:rPr>
-                <w:b w:val="false"/>
-                <w:bCs w:val="false"/>
-                <w:sz w:val="18"/>
-                <w:szCs w:val="18"/>
-              </w:rPr>
-              <w:t xml:space="preserve">Pairs play Senet on the home-made boards with the game phrases.</w:t>
-            </w:r>
-          </w:p>
-        </w:tc>
-        <w:tc>
-          <w:tcPr>
-            <w:tcW w:type="dxa" w:w="2260"/>
-            <w:tcMar>
-              <w:top w:type="dxa" w:w="60"/>
-              <w:left w:type="dxa" w:w="90"/>
-              <w:bottom w:type="dxa" w:w="60"/>
-              <w:right w:type="dxa" w:w="90"/>
-            </w:tcMar>
-          </w:tcPr>
-          <w:p>
-            <w:pPr>
-              <w:spacing w:after="40"/>
-            </w:pPr>
-            <w:r>
-              <w:rPr>
-                <w:b w:val="false"/>
-                <w:bCs w:val="false"/>
-                <w:sz w:val="18"/>
-                <w:szCs w:val="18"/>
-              </w:rPr>
-              <w:t xml:space="preserve">Play in English: my turn, your turn, I win.</w:t>
-            </w:r>
-          </w:p>
-        </w:tc>
-        <w:tc>
-          <w:tcPr>
-            <w:tcW w:type="dxa" w:w="1700"/>
-            <w:tcMar>
-              <w:top w:type="dxa" w:w="60"/>
-              <w:left w:type="dxa" w:w="90"/>
-              <w:bottom w:type="dxa" w:w="60"/>
-              <w:right w:type="dxa" w:w="90"/>
-            </w:tcMar>
-          </w:tcPr>
-          <w:p>
-            <w:pPr>
-              <w:spacing w:after="40"/>
-            </w:pPr>
-            <w:r>
-              <w:rPr>
-                <w:b w:val="false"/>
-                <w:bCs w:val="false"/>
-                <w:sz w:val="17"/>
-                <w:szCs w:val="17"/>
-              </w:rPr>
-              <w:t xml:space="preserve">Walk round; praise English.</w:t>
-            </w:r>
-          </w:p>
-        </w:tc>
-      </w:tr>
-      <w:tr>
-        <w:trPr>
-          <w:cantSplit/>
-        </w:trPr>
-        <w:tc>
-          <w:tcPr>
-            <w:tcW w:type="dxa" w:w="800"/>
-            <w:tcMar>
-              <w:top w:type="dxa" w:w="60"/>
-              <w:left w:type="dxa" w:w="90"/>
-              <w:bottom w:type="dxa" w:w="60"/>
-              <w:right w:type="dxa" w:w="90"/>
-            </w:tcMar>
-          </w:tcPr>
-          <w:p>
-            <w:pPr>
-              <w:spacing w:after="40"/>
-            </w:pPr>
-            <w:r>
-              <w:rPr>
-                <w:b w:val="false"/>
-                <w:bCs w:val="false"/>
-                <w:sz w:val="18"/>
-                <w:szCs w:val="18"/>
-              </w:rPr>
-              <w:t xml:space="preserve">L4 · 30–35</w:t>
-            </w:r>
-          </w:p>
-        </w:tc>
-        <w:tc>
-          <w:tcPr>
-            <w:tcW w:type="dxa" w:w="1800"/>
-            <w:tcMar>
-              <w:top w:type="dxa" w:w="60"/>
-              <w:left w:type="dxa" w:w="90"/>
-              <w:bottom w:type="dxa" w:w="60"/>
-              <w:right w:type="dxa" w:w="90"/>
-            </w:tcMar>
-          </w:tcPr>
-          <w:p>
-            <w:pPr>
-              <w:spacing w:after="40"/>
-            </w:pPr>
-            <w:r>
-              <w:rPr>
-                <w:b/>
-                <w:bCs/>
-                <w:sz w:val="18"/>
-                <w:szCs w:val="18"/>
-              </w:rPr>
-              <w:t xml:space="preserve">Write and finish</w:t>
-            </w:r>
-          </w:p>
-        </w:tc>
-        <w:tc>
-          <w:tcPr>
-            <w:tcW w:type="dxa" w:w="2800"/>
-            <w:tcMar>
-              <w:top w:type="dxa" w:w="60"/>
-              <w:left w:type="dxa" w:w="90"/>
-              <w:bottom w:type="dxa" w:w="60"/>
-              <w:right w:type="dxa" w:w="90"/>
-            </w:tcMar>
-          </w:tcPr>
-          <w:p>
-            <w:pPr>
-              <w:spacing w:after="40"/>
-            </w:pPr>
-            <w:r>
-              <w:rPr>
-                <w:b w:val="false"/>
-                <w:bCs w:val="false"/>
-                <w:sz w:val="18"/>
-                <w:szCs w:val="18"/>
-              </w:rPr>
-              <w:t xml:space="preserve">Writing frame: This is my … We use it to … It is … than … Certificates from the Pharaoh.</w:t>
-            </w:r>
-          </w:p>
-        </w:tc>
-        <w:tc>
-          <w:tcPr>
-            <w:tcW w:type="dxa" w:w="2260"/>
-            <w:tcMar>
-              <w:top w:type="dxa" w:w="60"/>
-              <w:left w:type="dxa" w:w="90"/>
-              <w:bottom w:type="dxa" w:w="60"/>
-              <w:right w:type="dxa" w:w="90"/>
-            </w:tcMar>
-          </w:tcPr>
-          <w:p>
-            <w:pPr>
-              <w:spacing w:after="40"/>
-            </w:pPr>
-            <w:r>
-              <w:rPr>
-                <w:b w:val="false"/>
-                <w:bCs w:val="false"/>
-                <w:sz w:val="18"/>
-                <w:szCs w:val="18"/>
-              </w:rPr>
-              <w:t xml:space="preserve">Write 3 sentences.</w:t>
-            </w:r>
-          </w:p>
-        </w:tc>
-        <w:tc>
-          <w:tcPr>
-            <w:tcW w:type="dxa" w:w="1700"/>
-            <w:tcMar>
-              <w:top w:type="dxa" w:w="60"/>
-              <w:left w:type="dxa" w:w="90"/>
-              <w:bottom w:type="dxa" w:w="60"/>
-              <w:right w:type="dxa" w:w="90"/>
-            </w:tcMar>
-          </w:tcPr>
-          <w:p>
-            <w:pPr>
-              <w:spacing w:after="40"/>
-            </w:pPr>
-            <w:r>
-              <w:rPr>
-                <w:b w:val="false"/>
-                <w:bCs w:val="false"/>
-                <w:sz w:val="17"/>
-                <w:szCs w:val="17"/>
-              </w:rPr>
-              <w:t xml:space="preserve">Collect the writing for marks.</w:t>
+              <w:t xml:space="preserve">Speaking /4, writing /3, +10 XP.</w:t>
             </w:r>
           </w:p>
         </w:tc>

</xml_diff>